<commit_message>
paper(ribci-cyted-2026): redraw figures as native Word vector diagrams
Replace the raster pipeline figures with native Word table-based flowcharts
(bordered boxes + arrows, monospace command labels) so they stay crisp at any
zoom instead of looking blurry when scaled. Refresh backup PDFs accordingly.
Formatting (numbered sections, Abstract/Index Terms labels, Times New Roman,
fixed tables) preserved.
</commit_message>
<xml_diff>
--- a/paper/ribci-cyted-2026/paper1-MIESC-anon.docx
+++ b/paper/ribci-cyted-2026/paper1-MIESC-anon.docx
@@ -705,55 +705,408 @@
         <w:t xml:space="preserve">).</w:t>
       </w:r>
     </w:p>
-    <w:p>
-      <w:pPr>
-        <w:pStyle w:val="CaptionedFigure"/>
-      </w:pPr>
-      <w:bookmarkStart w:id="27" w:name="fig:arch"/>
-      <w:r>
-        <w:drawing>
-          <wp:inline>
-            <wp:extent cx="3260034" cy="1727879"/>
-            <wp:effectExtent b="0" l="0" r="0" t="0"/>
-            <wp:docPr descr="MIESC pipeline: 9 defense layers with multi-provider LLM ensemble and intelligence engine for cross-tool confidence scoring." title="" id="1" name="Picture"/>
-            <a:graphic>
-              <a:graphicData uri="http://schemas.openxmlformats.org/drawingml/2006/picture">
-                <pic:pic>
-                  <pic:nvPicPr>
-                    <pic:cNvPr descr="figs/fig1-1.png" id="0" name="Picture"/>
-                    <pic:cNvPicPr>
-                      <a:picLocks noChangeArrowheads="1" noChangeAspect="1"/>
-                    </pic:cNvPicPr>
-                  </pic:nvPicPr>
-                  <pic:blipFill>
-                    <a:blip r:embed="rId26"/>
-                    <a:stretch>
-                      <a:fillRect/>
-                    </a:stretch>
-                  </pic:blipFill>
-                  <pic:spPr bwMode="auto">
-                    <a:xfrm>
-                      <a:off x="0" y="0"/>
-                      <a:ext cx="3260034" cy="1727879"/>
-                    </a:xfrm>
-                    <a:prstGeom prst="rect">
-                      <a:avLst/>
-                    </a:prstGeom>
-                    <a:noFill/>
-                    <a:ln w="9525">
-                      <a:noFill/>
-                      <a:headEnd/>
-                      <a:tailEnd/>
-                    </a:ln>
-                  </pic:spPr>
-                </pic:pic>
-              </a:graphicData>
-            </a:graphic>
-          </wp:inline>
-        </w:drawing>
-      </w:r>
-      <w:bookmarkEnd w:id="27"/>
-    </w:p>
+    <w:tbl>
+      <w:tblPr>
+        <w:tblW w:type="auto" w:w="0"/>
+        <w:jc w:val="center"/>
+        <w:tblLook w:firstColumn="1" w:firstRow="1" w:lastColumn="0" w:lastRow="0" w:noHBand="0" w:noVBand="1" w:val="04A0"/>
+        <w:tblW w:w="3960000" w:type="dxa"/>
+        <w:tblLayout w:type="fixed"/>
+      </w:tblPr>
+      <w:tblGrid>
+        <w:gridCol w:w="3960000"/>
+      </w:tblGrid>
+      <w:tr>
+        <w:tc>
+          <w:tcPr>
+            <w:tcW w:type="dxa" w:w="9072"/>
+            <w:tcW w:w="3960000" w:type="dxa"/>
+            <w:tcBorders>
+              <w:top w:val="single" w:sz="6" w:space="0" w:color="000000"/>
+              <w:left w:val="single" w:sz="6" w:space="0" w:color="000000"/>
+              <w:bottom w:val="single" w:sz="6" w:space="0" w:color="000000"/>
+              <w:right w:val="single" w:sz="6" w:space="0" w:color="000000"/>
+            </w:tcBorders>
+            <w:vAlign w:val="center"/>
+          </w:tcPr>
+          <w:p>
+            <w:pPr>
+              <w:spacing w:before="60" w:after="60"/>
+              <w:jc w:val="center"/>
+            </w:pPr>
+            <w:r>
+              <w:rPr>
+                <w:rFonts w:ascii="Times New Roman" w:hAnsi="Times New Roman"/>
+                <w:b/>
+              </w:rPr>
+              <w:t>Source code</w:t>
+            </w:r>
+            <w:r>
+              <w:rPr>
+                <w:rFonts w:ascii="Times New Roman" w:hAnsi="Times New Roman"/>
+              </w:rPr>
+              <w:t xml:space="preserve"> (.sol / .cairo / .move / .rs)</w:t>
+            </w:r>
+          </w:p>
+        </w:tc>
+      </w:tr>
+      <w:tr>
+        <w:tc>
+          <w:tcPr>
+            <w:tcW w:type="dxa" w:w="9072"/>
+            <w:tcW w:w="3960000" w:type="dxa"/>
+            <w:tcBorders>
+              <w:top w:val="nil"/>
+              <w:left w:val="nil"/>
+              <w:bottom w:val="nil"/>
+              <w:right w:val="nil"/>
+            </w:tcBorders>
+            <w:vAlign w:val="center"/>
+          </w:tcPr>
+          <w:p>
+            <w:pPr>
+              <w:spacing w:before="20" w:after="20"/>
+              <w:jc w:val="center"/>
+            </w:pPr>
+            <w:r>
+              <w:rPr>
+                <w:rFonts w:ascii="Times New Roman" w:hAnsi="Times New Roman"/>
+                <w:sz w:val="24"/>
+              </w:rPr>
+              <w:t>↓</w:t>
+            </w:r>
+          </w:p>
+        </w:tc>
+      </w:tr>
+      <w:tr>
+        <w:tc>
+          <w:tcPr>
+            <w:tcW w:type="dxa" w:w="9072"/>
+            <w:tcW w:w="3960000" w:type="dxa"/>
+            <w:tcBorders>
+              <w:top w:val="single" w:sz="6" w:space="0" w:color="000000"/>
+              <w:left w:val="single" w:sz="6" w:space="0" w:color="000000"/>
+              <w:bottom w:val="single" w:sz="6" w:space="0" w:color="000000"/>
+              <w:right w:val="single" w:sz="6" w:space="0" w:color="000000"/>
+            </w:tcBorders>
+            <w:vAlign w:val="center"/>
+          </w:tcPr>
+          <w:p>
+            <w:pPr>
+              <w:spacing w:before="60" w:after="60"/>
+              <w:jc w:val="center"/>
+            </w:pPr>
+            <w:r>
+              <w:rPr>
+                <w:rFonts w:ascii="Times New Roman" w:hAnsi="Times New Roman"/>
+                <w:b/>
+              </w:rPr>
+              <w:t xml:space="preserve">L1–4: </w:t>
+            </w:r>
+            <w:r>
+              <w:rPr>
+                <w:rFonts w:ascii="Times New Roman" w:hAnsi="Times New Roman"/>
+              </w:rPr>
+              <w:t>Slither · Aderyn · Mythril · Halmos · Echidna · Certora</w:t>
+            </w:r>
+          </w:p>
+        </w:tc>
+      </w:tr>
+      <w:tr>
+        <w:tc>
+          <w:tcPr>
+            <w:tcW w:type="dxa" w:w="9072"/>
+            <w:tcW w:w="3960000" w:type="dxa"/>
+            <w:tcBorders>
+              <w:top w:val="nil"/>
+              <w:left w:val="nil"/>
+              <w:bottom w:val="nil"/>
+              <w:right w:val="nil"/>
+            </w:tcBorders>
+            <w:vAlign w:val="center"/>
+          </w:tcPr>
+          <w:p>
+            <w:pPr>
+              <w:spacing w:before="20" w:after="20"/>
+              <w:jc w:val="center"/>
+            </w:pPr>
+            <w:r>
+              <w:rPr>
+                <w:rFonts w:ascii="Times New Roman" w:hAnsi="Times New Roman"/>
+                <w:sz w:val="24"/>
+              </w:rPr>
+              <w:t>↓</w:t>
+            </w:r>
+          </w:p>
+        </w:tc>
+      </w:tr>
+      <w:tr>
+        <w:tc>
+          <w:tcPr>
+            <w:tcW w:type="dxa" w:w="9072"/>
+            <w:tcW w:w="3960000" w:type="dxa"/>
+            <w:tcBorders>
+              <w:top w:val="single" w:sz="6" w:space="0" w:color="000000"/>
+              <w:left w:val="single" w:sz="6" w:space="0" w:color="000000"/>
+              <w:bottom w:val="single" w:sz="6" w:space="0" w:color="000000"/>
+              <w:right w:val="single" w:sz="6" w:space="0" w:color="000000"/>
+            </w:tcBorders>
+            <w:vAlign w:val="center"/>
+          </w:tcPr>
+          <w:p>
+            <w:pPr>
+              <w:spacing w:before="60" w:after="60"/>
+              <w:jc w:val="center"/>
+            </w:pPr>
+            <w:r>
+              <w:rPr>
+                <w:rFonts w:ascii="Times New Roman" w:hAnsi="Times New Roman"/>
+                <w:b/>
+              </w:rPr>
+              <w:t xml:space="preserve">L5–6: </w:t>
+            </w:r>
+            <w:r>
+              <w:rPr>
+                <w:rFonts w:ascii="Times New Roman" w:hAnsi="Times New Roman"/>
+              </w:rPr>
+              <w:t>Multi-provider LLM ensemble + RAG + Protocol map</w:t>
+            </w:r>
+          </w:p>
+        </w:tc>
+      </w:tr>
+      <w:tr>
+        <w:tc>
+          <w:tcPr>
+            <w:tcW w:type="dxa" w:w="9072"/>
+            <w:tcW w:w="3960000" w:type="dxa"/>
+            <w:tcBorders>
+              <w:top w:val="nil"/>
+              <w:left w:val="nil"/>
+              <w:bottom w:val="nil"/>
+              <w:right w:val="nil"/>
+            </w:tcBorders>
+            <w:vAlign w:val="center"/>
+          </w:tcPr>
+          <w:p>
+            <w:pPr>
+              <w:spacing w:before="20" w:after="20"/>
+              <w:jc w:val="center"/>
+            </w:pPr>
+            <w:r>
+              <w:rPr>
+                <w:rFonts w:ascii="Times New Roman" w:hAnsi="Times New Roman"/>
+                <w:sz w:val="24"/>
+              </w:rPr>
+              <w:t>↓</w:t>
+            </w:r>
+          </w:p>
+        </w:tc>
+      </w:tr>
+      <w:tr>
+        <w:tc>
+          <w:tcPr>
+            <w:tcW w:type="dxa" w:w="9072"/>
+            <w:tcW w:w="3960000" w:type="dxa"/>
+            <w:tcBorders>
+              <w:top w:val="single" w:sz="6" w:space="0" w:color="000000"/>
+              <w:left w:val="single" w:sz="6" w:space="0" w:color="000000"/>
+              <w:bottom w:val="single" w:sz="6" w:space="0" w:color="000000"/>
+              <w:right w:val="single" w:sz="6" w:space="0" w:color="000000"/>
+            </w:tcBorders>
+            <w:vAlign w:val="center"/>
+          </w:tcPr>
+          <w:p>
+            <w:pPr>
+              <w:spacing w:before="60" w:after="60"/>
+              <w:jc w:val="center"/>
+            </w:pPr>
+            <w:r>
+              <w:rPr>
+                <w:rFonts w:ascii="Times New Roman" w:hAnsi="Times New Roman"/>
+                <w:b/>
+              </w:rPr>
+              <w:t xml:space="preserve">Intelligence: </w:t>
+            </w:r>
+            <w:r>
+              <w:rPr>
+                <w:rFonts w:ascii="Times New Roman" w:hAnsi="Times New Roman"/>
+              </w:rPr>
+              <w:t>Bayesian confidence · Dedup · FP suppression</w:t>
+            </w:r>
+          </w:p>
+        </w:tc>
+      </w:tr>
+      <w:tr>
+        <w:tc>
+          <w:tcPr>
+            <w:tcW w:type="dxa" w:w="9072"/>
+            <w:tcW w:w="3960000" w:type="dxa"/>
+            <w:tcBorders>
+              <w:top w:val="nil"/>
+              <w:left w:val="nil"/>
+              <w:bottom w:val="nil"/>
+              <w:right w:val="nil"/>
+            </w:tcBorders>
+            <w:vAlign w:val="center"/>
+          </w:tcPr>
+          <w:p>
+            <w:pPr>
+              <w:spacing w:before="20" w:after="20"/>
+              <w:jc w:val="center"/>
+            </w:pPr>
+            <w:r>
+              <w:rPr>
+                <w:rFonts w:ascii="Times New Roman" w:hAnsi="Times New Roman"/>
+                <w:sz w:val="24"/>
+              </w:rPr>
+              <w:t>↓</w:t>
+            </w:r>
+          </w:p>
+        </w:tc>
+      </w:tr>
+      <w:tr>
+        <w:tc>
+          <w:tcPr>
+            <w:tcW w:type="dxa" w:w="9072"/>
+            <w:tcW w:w="3960000" w:type="dxa"/>
+            <w:tcBorders>
+              <w:top w:val="single" w:sz="6" w:space="0" w:color="000000"/>
+              <w:left w:val="single" w:sz="6" w:space="0" w:color="000000"/>
+              <w:bottom w:val="single" w:sz="6" w:space="0" w:color="000000"/>
+              <w:right w:val="single" w:sz="6" w:space="0" w:color="000000"/>
+            </w:tcBorders>
+            <w:vAlign w:val="center"/>
+          </w:tcPr>
+          <w:p>
+            <w:pPr>
+              <w:spacing w:before="60" w:after="60"/>
+              <w:jc w:val="center"/>
+            </w:pPr>
+            <w:r>
+              <w:rPr>
+                <w:rFonts w:ascii="Times New Roman" w:hAnsi="Times New Roman"/>
+                <w:b/>
+              </w:rPr>
+              <w:t xml:space="preserve">L7–9: </w:t>
+            </w:r>
+            <w:r>
+              <w:rPr>
+                <w:rFonts w:ascii="Times New Roman" w:hAnsi="Times New Roman"/>
+              </w:rPr>
+              <w:t>DeFi patterns · Exploit validation · Consensus</w:t>
+            </w:r>
+          </w:p>
+        </w:tc>
+      </w:tr>
+      <w:tr>
+        <w:tc>
+          <w:tcPr>
+            <w:tcW w:type="dxa" w:w="9072"/>
+            <w:tcW w:w="3960000" w:type="dxa"/>
+            <w:tcBorders>
+              <w:top w:val="nil"/>
+              <w:left w:val="nil"/>
+              <w:bottom w:val="nil"/>
+              <w:right w:val="nil"/>
+            </w:tcBorders>
+            <w:vAlign w:val="center"/>
+          </w:tcPr>
+          <w:p>
+            <w:pPr>
+              <w:spacing w:before="20" w:after="20"/>
+              <w:jc w:val="center"/>
+            </w:pPr>
+            <w:r>
+              <w:rPr>
+                <w:rFonts w:ascii="Times New Roman" w:hAnsi="Times New Roman"/>
+                <w:sz w:val="24"/>
+              </w:rPr>
+              <w:t>↓</w:t>
+            </w:r>
+          </w:p>
+        </w:tc>
+      </w:tr>
+      <w:tr>
+        <w:tc>
+          <w:tcPr>
+            <w:tcW w:type="dxa" w:w="9072"/>
+            <w:tcW w:w="3960000" w:type="dxa"/>
+            <w:tcBorders>
+              <w:top w:val="single" w:sz="6" w:space="0" w:color="000000"/>
+              <w:left w:val="single" w:sz="6" w:space="0" w:color="000000"/>
+              <w:bottom w:val="single" w:sz="6" w:space="0" w:color="000000"/>
+              <w:right w:val="single" w:sz="6" w:space="0" w:color="000000"/>
+            </w:tcBorders>
+            <w:vAlign w:val="center"/>
+          </w:tcPr>
+          <w:p>
+            <w:pPr>
+              <w:spacing w:before="60" w:after="60"/>
+              <w:jc w:val="center"/>
+            </w:pPr>
+            <w:r>
+              <w:rPr>
+                <w:rFonts w:ascii="Times New Roman" w:hAnsi="Times New Roman"/>
+                <w:b/>
+              </w:rPr>
+              <w:t xml:space="preserve">Output: </w:t>
+            </w:r>
+            <w:r>
+              <w:rPr>
+                <w:rFonts w:ascii="Times New Roman" w:hAnsi="Times New Roman"/>
+              </w:rPr>
+              <w:t xml:space="preserve">Report · SARIF · </w:t>
+            </w:r>
+            <w:r>
+              <w:rPr>
+                <w:rFonts w:ascii="Consolas" w:hAnsi="Consolas"/>
+                <w:sz w:val="19"/>
+              </w:rPr>
+              <w:t>fix</w:t>
+            </w:r>
+            <w:r>
+              <w:rPr>
+                <w:rFonts w:ascii="Times New Roman" w:hAnsi="Times New Roman"/>
+              </w:rPr>
+              <w:t xml:space="preserve"> · </w:t>
+            </w:r>
+            <w:r>
+              <w:rPr>
+                <w:rFonts w:ascii="Consolas" w:hAnsi="Consolas"/>
+                <w:sz w:val="19"/>
+              </w:rPr>
+              <w:t>test-gen</w:t>
+            </w:r>
+            <w:r>
+              <w:rPr>
+                <w:rFonts w:ascii="Times New Roman" w:hAnsi="Times New Roman"/>
+              </w:rPr>
+              <w:t xml:space="preserve"> · </w:t>
+            </w:r>
+            <w:r>
+              <w:rPr>
+                <w:rFonts w:ascii="Consolas" w:hAnsi="Consolas"/>
+                <w:sz w:val="19"/>
+              </w:rPr>
+              <w:t>verify</w:t>
+            </w:r>
+            <w:r>
+              <w:rPr>
+                <w:rFonts w:ascii="Times New Roman" w:hAnsi="Times New Roman"/>
+              </w:rPr>
+              <w:t xml:space="preserve"> · </w:t>
+            </w:r>
+            <w:r>
+              <w:rPr>
+                <w:rFonts w:ascii="Consolas" w:hAnsi="Consolas"/>
+                <w:sz w:val="19"/>
+              </w:rPr>
+              <w:t>compliance</w:t>
+            </w:r>
+          </w:p>
+        </w:tc>
+      </w:tr>
+    </w:tbl>
     <w:p>
       <w:pPr>
         <w:pStyle w:val="ImageCaption"/>

</xml_diff>